<commit_message>
Apply confirmed TA dates, lab instrumentation and auto lab gallery
- Processor-Based Systems Design TA is the current role (Feb 2026 –
  present); Arduino 101 was Jan – Jun 2025. Custom PCBs dated 2026.
- Lab & Instrumentation skills filled with confirmed instruments.
- Lab gallery switches on automatically once 3+ photos exist and
  section numbering adapts to the visible sections.
- Résumé regenerated with the same corrections.

Co-Authored-By: Claude Opus 5.5 <noreply@anthropic.com>
</commit_message>
<xml_diff>
--- a/docs/cv/Nicolas_Gomez_CV.docx
+++ b/docs/cv/Nicolas_Gomez_CV.docx
@@ -270,6 +270,26 @@
     </w:p>
     <w:p>
       <w:pPr>
+        <w:spacing w:before="0" w:after="20" w:line="240" w:lineRule="auto"/>
+        <w:ind w:left="0"/>
+      </w:pPr>
+      <w:r>
+        <w:rPr>
+          <w:b/>
+          <w:i w:val="0"/>
+        </w:rPr>
+        <w:t xml:space="preserve">Lab &amp; Instrumentation: </w:t>
+      </w:r>
+      <w:r>
+        <w:rPr>
+          <w:b w:val="0"/>
+          <w:i w:val="0"/>
+        </w:rPr>
+        <w:t>Oscilloscope, digital multimeter, bench power supply, function generator, soldering</w:t>
+      </w:r>
+    </w:p>
+    <w:p>
+      <w:pPr>
         <w:spacing w:before="120" w:after="40" w:line="240" w:lineRule="auto"/>
         <w:pBdr>
           <w:bottom w:val="single" w:sz="6" w:space="1" w:color="0E5A70"/>
@@ -283,6 +303,80 @@
           <w:sz w:val="21"/>
         </w:rPr>
         <w:t>EXPERIENCE</w:t>
+      </w:r>
+    </w:p>
+    <w:p>
+      <w:pPr>
+        <w:tabs>
+          <w:tab w:pos="10512" w:val="right"/>
+        </w:tabs>
+        <w:spacing w:before="60" w:after="0" w:line="240" w:lineRule="auto"/>
+      </w:pPr>
+      <w:r>
+        <w:rPr>
+          <w:b/>
+          <w:i w:val="0"/>
+        </w:rPr>
+        <w:t>Teaching Assistant — Processor-Based Systems Design</w:t>
+      </w:r>
+      <w:r>
+        <w:rPr>
+          <w:b w:val="0"/>
+          <w:i w:val="0"/>
+          <w:color w:val="444E5A"/>
+        </w:rPr>
+        <w:t>, Pontificia Universidad Javeriana</w:t>
+      </w:r>
+      <w:r>
+        <w:rPr>
+          <w:b w:val="0"/>
+          <w:i w:val="0"/>
+          <w:color w:val="444E5A"/>
+        </w:rPr>
+        <w:tab/>
+        <w:t>Feb 2026 – Present</w:t>
+      </w:r>
+    </w:p>
+    <w:p>
+      <w:pPr>
+        <w:pStyle w:val="ListBullet"/>
+        <w:spacing w:before="0" w:after="20" w:line="240" w:lineRule="auto"/>
+        <w:ind w:left="288" w:hanging="202"/>
+      </w:pPr>
+      <w:r>
+        <w:rPr>
+          <w:b w:val="0"/>
+          <w:i w:val="0"/>
+        </w:rPr>
+        <w:t>Designed and developed custom PCBs in Altium Designer for hands-on experimentation with course concepts.</w:t>
+      </w:r>
+    </w:p>
+    <w:p>
+      <w:pPr>
+        <w:pStyle w:val="ListBullet"/>
+        <w:spacing w:before="0" w:after="20" w:line="240" w:lineRule="auto"/>
+        <w:ind w:left="288" w:hanging="202"/>
+      </w:pPr>
+      <w:r>
+        <w:rPr>
+          <w:b w:val="0"/>
+          <w:i w:val="0"/>
+        </w:rPr>
+        <w:t>Resolve office-hours questions on embedded C, finite-state machines, interrupts and timing analysis.</w:t>
+      </w:r>
+    </w:p>
+    <w:p>
+      <w:pPr>
+        <w:pStyle w:val="ListBullet"/>
+        <w:spacing w:before="0" w:after="20" w:line="240" w:lineRule="auto"/>
+        <w:ind w:left="288" w:hanging="202"/>
+      </w:pPr>
+      <w:r>
+        <w:rPr>
+          <w:b w:val="0"/>
+          <w:i w:val="0"/>
+        </w:rPr>
+        <w:t>Support embedded-systems and microprocessor course projects; explain digital-system architectures.</w:t>
       </w:r>
     </w:p>
     <w:p>
@@ -314,66 +408,6 @@
           <w:color w:val="444E5A"/>
         </w:rPr>
         <w:tab/>
-        <w:t>Feb 2026 – Present</w:t>
-      </w:r>
-    </w:p>
-    <w:p>
-      <w:pPr>
-        <w:pStyle w:val="ListBullet"/>
-        <w:spacing w:before="0" w:after="20" w:line="240" w:lineRule="auto"/>
-        <w:ind w:left="288" w:hanging="202"/>
-      </w:pPr>
-      <w:r>
-        <w:rPr>
-          <w:b w:val="0"/>
-          <w:i w:val="0"/>
-        </w:rPr>
-        <w:t>Guide undergraduate students through sensors, actuators and peripheral devices on the Arduino platform.</w:t>
-      </w:r>
-    </w:p>
-    <w:p>
-      <w:pPr>
-        <w:pStyle w:val="ListBullet"/>
-        <w:spacing w:before="0" w:after="20" w:line="240" w:lineRule="auto"/>
-        <w:ind w:left="288" w:hanging="202"/>
-      </w:pPr>
-      <w:r>
-        <w:rPr>
-          <w:b w:val="0"/>
-          <w:i w:val="0"/>
-        </w:rPr>
-        <w:t>Mentor projects from system design to implementation; debug embedded C (memory management, optimization).</w:t>
-      </w:r>
-    </w:p>
-    <w:p>
-      <w:pPr>
-        <w:tabs>
-          <w:tab w:pos="10512" w:val="right"/>
-        </w:tabs>
-        <w:spacing w:before="60" w:after="0" w:line="240" w:lineRule="auto"/>
-      </w:pPr>
-      <w:r>
-        <w:rPr>
-          <w:b/>
-          <w:i w:val="0"/>
-        </w:rPr>
-        <w:t>Teaching Assistant — Processor-Based Systems Design</w:t>
-      </w:r>
-      <w:r>
-        <w:rPr>
-          <w:b w:val="0"/>
-          <w:i w:val="0"/>
-          <w:color w:val="444E5A"/>
-        </w:rPr>
-        <w:t>, Pontificia Universidad Javeriana</w:t>
-      </w:r>
-      <w:r>
-        <w:rPr>
-          <w:b w:val="0"/>
-          <w:i w:val="0"/>
-          <w:color w:val="444E5A"/>
-        </w:rPr>
-        <w:tab/>
         <w:t>Jan 2025 – Jun 2025</w:t>
       </w:r>
     </w:p>
@@ -388,7 +422,7 @@
           <w:b w:val="0"/>
           <w:i w:val="0"/>
         </w:rPr>
-        <w:t>Designed and developed custom PCBs in Altium Designer for hands-on experimentation with course concepts.</w:t>
+        <w:t>Guided undergraduate students through sensors, actuators and peripheral devices on the Arduino platform.</w:t>
       </w:r>
     </w:p>
     <w:p>
@@ -402,21 +436,7 @@
           <w:b w:val="0"/>
           <w:i w:val="0"/>
         </w:rPr>
-        <w:t>Resolved office-hours questions on embedded C, finite-state machines, interrupts and timing analysis.</w:t>
-      </w:r>
-    </w:p>
-    <w:p>
-      <w:pPr>
-        <w:pStyle w:val="ListBullet"/>
-        <w:spacing w:before="0" w:after="20" w:line="240" w:lineRule="auto"/>
-        <w:ind w:left="288" w:hanging="202"/>
-      </w:pPr>
-      <w:r>
-        <w:rPr>
-          <w:b w:val="0"/>
-          <w:i w:val="0"/>
-        </w:rPr>
-        <w:t>Supported embedded-systems and microprocessor course projects; explained digital-system architectures.</w:t>
+        <w:t>Mentored projects from system design to implementation; debugged embedded C (memory management, optimization).</w:t>
       </w:r>
     </w:p>
     <w:p>
@@ -571,7 +591,7 @@
           <w:color w:val="444E5A"/>
         </w:rPr>
         <w:tab/>
-        <w:t>2025</w:t>
+        <w:t>2026</w:t>
       </w:r>
     </w:p>
     <w:p>

</xml_diff>

<commit_message>
Regenerate OG image and backup CV; add materials guide
- public/og.png is now generated from scripts/og.html (node scripts/og.mjs) with the
  data in content.js: GPA 4.3/5.0 and nicolasgomez.dev.
- Backup CV (scripts/build_cv.py) reads email, phone, LinkedIn and GPA from content.js,
  splits academic and professional experience, adds the freelance role, the AI group,
  FSM, 1-Wire, Verilog, analog filters, Vercel and Windows, and lists the seven hardware
  projects in the site's order on one page.
- Software cards show an optional screenshot when public/media/software/<id>/screen exists.
- docs/MATERIALS.md: prioritized list of every file and data point still missing, with
  exact names, drop folder (incoming/, git-ignored), final path, format, size and weight.
- README documents the domain, CV picker, media map and verification scripts.

Co-Authored-By: Claude Opus 5.5 <noreply@anthropic.com>
</commit_message>
<xml_diff>
--- a/docs/cv/Nicolas_Gomez_CV.docx
+++ b/docs/cv/Nicolas_Gomez_CV.docx
@@ -40,7 +40,7 @@
           <w:i w:val="0"/>
           <w:color w:val="444E5A"/>
         </w:rPr>
-        <w:t xml:space="preserve">Bogotá, Colombia | +57 317 269 5193 | </w:t>
+        <w:t xml:space="preserve">Bogotá, Colombia | +57 317 269 5193 (WhatsApp) | </w:t>
       </w:r>
       <w:hyperlink r:id="rId9">
         <w:r>
@@ -50,20 +50,17 @@
           <w:t xml:space="preserve">nandres-gomez@javeriana.edu.co</w:t>
         </w:r>
       </w:hyperlink>
-      <w:r>
-        <w:rPr>
-          <w:b w:val="0"/>
-          <w:i w:val="0"/>
-          <w:color w:val="444E5A"/>
-        </w:rPr>
-        <w:t xml:space="preserve"> | </w:t>
-      </w:r>
+    </w:p>
+    <w:p>
+      <w:pPr>
+        <w:spacing w:before="0" w:after="0" w:line="240" w:lineRule="auto"/>
+      </w:pPr>
       <w:hyperlink r:id="rId10">
         <w:r>
           <w:rPr>
             <w:color w:val="0E5A70"/>
           </w:rPr>
-          <w:t xml:space="preserve">nicolas-gomez.vercel.app</w:t>
+          <w:t xml:space="preserve">nicolasgomez.dev</w:t>
         </w:r>
       </w:hyperlink>
       <w:r>
@@ -80,6 +77,22 @@
             <w:color w:val="0E5A70"/>
           </w:rPr>
           <w:t xml:space="preserve">github.com/NicoGomez4262</w:t>
+        </w:r>
+      </w:hyperlink>
+      <w:r>
+        <w:rPr>
+          <w:b w:val="0"/>
+          <w:i w:val="0"/>
+          <w:color w:val="444E5A"/>
+        </w:rPr>
+        <w:t xml:space="preserve"> | </w:t>
+      </w:r>
+      <w:hyperlink r:id="rId12">
+        <w:r>
+          <w:rPr>
+            <w:color w:val="0E5A70"/>
+          </w:rPr>
+          <w:t xml:space="preserve">linkedin.com/in/nicolás-gómez-2b5709428</w:t>
         </w:r>
       </w:hyperlink>
     </w:p>
@@ -148,7 +161,7 @@
           <w:b w:val="0"/>
           <w:i w:val="0"/>
         </w:rPr>
-        <w:t xml:space="preserve">  |  GPA: 4.25 / 5.0</w:t>
+        <w:t xml:space="preserve">  |  GPA: 4.3 / 5.0</w:t>
       </w:r>
     </w:p>
     <w:p>
@@ -185,7 +198,7 @@
           <w:b w:val="0"/>
           <w:i w:val="0"/>
         </w:rPr>
-        <w:t>Altium Designer (schematic capture, PCB layout), LTspice, 3D design &amp; printing</w:t>
+        <w:t>Altium Designer (schematic capture, PCB layout; 4+ custom PCBs to date), LTspice, 3D design &amp; printing</w:t>
       </w:r>
     </w:p>
     <w:p>
@@ -205,7 +218,7 @@
           <w:b w:val="0"/>
           <w:i w:val="0"/>
         </w:rPr>
-        <w:t>C, C++; PIC (MPLAB X, MCC), Arduino Uno / Mega 2560, Raspberry Pi (Python, GPIO); SPI, UART, I²C, PWM, MQTT; FSMs, interrupts, timing analysis</w:t>
+        <w:t>C, C++, MicroPython; PIC (MPLAB X, MCC), Arduino Uno / Mega 2560, Raspberry Pi (Python, GPIO); SPI, UART, I²C, 1-Wire, PWM, MQTT; finite-state machines (FSM), interrupts, timing analysis</w:t>
       </w:r>
     </w:p>
     <w:p>
@@ -225,7 +238,7 @@
           <w:b w:val="0"/>
           <w:i w:val="0"/>
         </w:rPr>
-        <w:t>IR sensor, analog inputs, 12-bit SPI ADC/DAC; DC motor control (H-bridge, PWM), servo control</w:t>
+        <w:t>IR, ADXL345 accelerometer, 12-bit SPI ADC/DAC; SSD1306 OLED, I²C LCD, LED matrices; DC motor control (H-bridge, PWM), servo control</w:t>
       </w:r>
     </w:p>
     <w:p>
@@ -238,14 +251,34 @@
           <w:b/>
           <w:i w:val="0"/>
         </w:rPr>
-        <w:t xml:space="preserve">Digital Design &amp; Signals: </w:t>
+        <w:t xml:space="preserve">Digital Design: </w:t>
       </w:r>
       <w:r>
         <w:rPr>
           <w:b w:val="0"/>
           <w:i w:val="0"/>
         </w:rPr>
-        <w:t>VHDL, Intel Quartus, ModelSim; MATLAB, FIR/IIR filter design</w:t>
+        <w:t>VHDL, Verilog; Intel Quartus, ModelSim testbenches; Cyclone IV E FPGA (DE2-115), VGA timing</w:t>
+      </w:r>
+    </w:p>
+    <w:p>
+      <w:pPr>
+        <w:spacing w:before="0" w:after="20" w:line="240" w:lineRule="auto"/>
+        <w:ind w:left="0"/>
+      </w:pPr>
+      <w:r>
+        <w:rPr>
+          <w:b/>
+          <w:i w:val="0"/>
+        </w:rPr>
+        <w:t xml:space="preserve">Signals: </w:t>
+      </w:r>
+      <w:r>
+        <w:rPr>
+          <w:b w:val="0"/>
+          <w:i w:val="0"/>
+        </w:rPr>
+        <w:t>MATLAB; FIR/IIR filter design, FIR on MCU; analog and anti-aliasing filter design; correlation-based detection</w:t>
       </w:r>
     </w:p>
     <w:p>
@@ -265,7 +298,27 @@
           <w:b w:val="0"/>
           <w:i w:val="0"/>
         </w:rPr>
-        <w:t>Python, JavaScript/TypeScript, React, Next.js, Firebase, PostgreSQL, Git, Linux</w:t>
+        <w:t>Python, JavaScript/TypeScript, React, Next.js, Firebase, PostgreSQL; Git, Linux, Windows, Vercel</w:t>
+      </w:r>
+    </w:p>
+    <w:p>
+      <w:pPr>
+        <w:spacing w:before="0" w:after="20" w:line="240" w:lineRule="auto"/>
+        <w:ind w:left="0"/>
+      </w:pPr>
+      <w:r>
+        <w:rPr>
+          <w:b/>
+          <w:i w:val="0"/>
+        </w:rPr>
+        <w:t xml:space="preserve">AI: </w:t>
+      </w:r>
+      <w:r>
+        <w:rPr>
+          <w:b w:val="0"/>
+          <w:i w:val="0"/>
+        </w:rPr>
+        <w:t>Claude Code, Codex (coding agents); Higgsfield (generative media)</w:t>
       </w:r>
     </w:p>
     <w:p>
@@ -302,7 +355,7 @@
           <w:color w:val="0E5A70"/>
           <w:sz w:val="21"/>
         </w:rPr>
-        <w:t>EXPERIENCE</w:t>
+        <w:t>ACADEMIC EXPERIENCE</w:t>
       </w:r>
     </w:p>
     <w:p>
@@ -348,7 +401,7 @@
           <w:b w:val="0"/>
           <w:i w:val="0"/>
         </w:rPr>
-        <w:t>Designed and developed custom PCBs in Altium Designer for hands-on experimentation with course concepts.</w:t>
+        <w:t>Designed and developed custom PCBs in Altium Designer, from schematic capture to layout, for hands-on experimentation with course concepts.</w:t>
       </w:r>
     </w:p>
     <w:p>
@@ -362,21 +415,7 @@
           <w:b w:val="0"/>
           <w:i w:val="0"/>
         </w:rPr>
-        <w:t>Resolve office-hours questions on embedded C, finite-state machines, interrupts and timing analysis.</w:t>
-      </w:r>
-    </w:p>
-    <w:p>
-      <w:pPr>
-        <w:pStyle w:val="ListBullet"/>
-        <w:spacing w:before="0" w:after="20" w:line="240" w:lineRule="auto"/>
-        <w:ind w:left="288" w:hanging="202"/>
-      </w:pPr>
-      <w:r>
-        <w:rPr>
-          <w:b w:val="0"/>
-          <w:i w:val="0"/>
-        </w:rPr>
-        <w:t>Support embedded-systems and microprocessor course projects; explain digital-system architectures.</w:t>
+        <w:t>Resolve office-hours questions on embedded C, finite-state machines, interrupts and timing analysis; support embedded-systems and microprocessor course projects.</w:t>
       </w:r>
     </w:p>
     <w:p>
@@ -422,21 +461,24 @@
           <w:b w:val="0"/>
           <w:i w:val="0"/>
         </w:rPr>
-        <w:t>Guided undergraduate students through sensors, actuators and peripheral devices on the Arduino platform.</w:t>
+        <w:t>Guided students through sensors, actuators and peripherals on Arduino; mentored projects from design to implementation and debugged embedded C (memory management, optimization).</w:t>
       </w:r>
     </w:p>
     <w:p>
       <w:pPr>
-        <w:pStyle w:val="ListBullet"/>
-        <w:spacing w:before="0" w:after="20" w:line="240" w:lineRule="auto"/>
-        <w:ind w:left="288" w:hanging="202"/>
+        <w:spacing w:before="120" w:after="40" w:line="240" w:lineRule="auto"/>
+        <w:pBdr>
+          <w:bottom w:val="single" w:sz="6" w:space="1" w:color="0E5A70"/>
+        </w:pBdr>
       </w:pPr>
       <w:r>
         <w:rPr>
-          <w:b w:val="0"/>
+          <w:b/>
           <w:i w:val="0"/>
+          <w:color w:val="0E5A70"/>
+          <w:sz w:val="21"/>
         </w:rPr>
-        <w:t>Mentored projects from system design to implementation; debugged embedded C (memory management, optimization).</w:t>
+        <w:t>PROFESSIONAL EXPERIENCE</w:t>
       </w:r>
     </w:p>
     <w:p>
@@ -451,7 +493,7 @@
           <w:b/>
           <w:i w:val="0"/>
         </w:rPr>
-        <w:t>Academic Tutor — Programa Tu</w:t>
+        <w:t>Academic Tutor — Programa Tú</w:t>
       </w:r>
       <w:r>
         <w:rPr>
@@ -459,7 +501,7 @@
           <w:i w:val="0"/>
           <w:color w:val="444E5A"/>
         </w:rPr>
-        <w:t>, Instituto Alberto Merani</w:t>
+        <w:t>, Bogotá, Colombia</w:t>
       </w:r>
       <w:r>
         <w:rPr>
@@ -482,7 +524,53 @@
           <w:b w:val="0"/>
           <w:i w:val="0"/>
         </w:rPr>
-        <w:t>Deliver one-on-one tutoring in physics, mathematics, critical thinking and language (22+ contracted hours).</w:t>
+        <w:t>Provide personalized tutoring in physics, mathematics, critical thinking and language to students at Instituto Alberto Merani (22+ contracted hours).</w:t>
+      </w:r>
+    </w:p>
+    <w:p>
+      <w:pPr>
+        <w:tabs>
+          <w:tab w:pos="10512" w:val="right"/>
+        </w:tabs>
+        <w:spacing w:before="60" w:after="0" w:line="240" w:lineRule="auto"/>
+      </w:pPr>
+      <w:r>
+        <w:rPr>
+          <w:b/>
+          <w:i w:val="0"/>
+        </w:rPr>
+        <w:t>Freelance Web Developer</w:t>
+      </w:r>
+      <w:r>
+        <w:rPr>
+          <w:b w:val="0"/>
+          <w:i w:val="0"/>
+          <w:color w:val="444E5A"/>
+        </w:rPr>
+        <w:t>, Independent businesses</w:t>
+      </w:r>
+      <w:r>
+        <w:rPr>
+          <w:b w:val="0"/>
+          <w:i w:val="0"/>
+          <w:color w:val="444E5A"/>
+        </w:rPr>
+        <w:tab/>
+        <w:t>Jul 2026 – Present</w:t>
+      </w:r>
+    </w:p>
+    <w:p>
+      <w:pPr>
+        <w:pStyle w:val="ListBullet"/>
+        <w:spacing w:before="0" w:after="20" w:line="240" w:lineRule="auto"/>
+        <w:ind w:left="288" w:hanging="202"/>
+      </w:pPr>
+      <w:r>
+        <w:rPr>
+          <w:b w:val="0"/>
+          <w:i w:val="0"/>
+        </w:rPr>
+        <w:t>Develop web applications for independent businesses, from requirements definition through implementation and delivery of solutions tailored to their needs.</w:t>
       </w:r>
     </w:p>
     <w:p>
@@ -500,6 +588,52 @@
           <w:sz w:val="21"/>
         </w:rPr>
         <w:t>HARDWARE PROJECTS</w:t>
+      </w:r>
+    </w:p>
+    <w:p>
+      <w:pPr>
+        <w:tabs>
+          <w:tab w:pos="10512" w:val="right"/>
+        </w:tabs>
+        <w:spacing w:before="60" w:after="0" w:line="240" w:lineRule="auto"/>
+      </w:pPr>
+      <w:r>
+        <w:rPr>
+          <w:b/>
+          <w:i w:val="0"/>
+        </w:rPr>
+        <w:t>PROTEO — Raspberry Pi IoT Node for a Smart Luggage Locker</w:t>
+      </w:r>
+      <w:r>
+        <w:rPr>
+          <w:b w:val="0"/>
+          <w:i w:val="0"/>
+          <w:color w:val="444E5A"/>
+        </w:rPr>
+        <w:t xml:space="preserve">  |  Python, MQTT, Firebase</w:t>
+      </w:r>
+      <w:r>
+        <w:rPr>
+          <w:b w:val="0"/>
+          <w:i w:val="0"/>
+          <w:color w:val="444E5A"/>
+        </w:rPr>
+        <w:tab/>
+        <w:t>2025</w:t>
+      </w:r>
+    </w:p>
+    <w:p>
+      <w:pPr>
+        <w:pStyle w:val="ListBullet"/>
+        <w:spacing w:before="0" w:after="20" w:line="240" w:lineRule="auto"/>
+        <w:ind w:left="288" w:hanging="202"/>
+      </w:pPr>
+      <w:r>
+        <w:rPr>
+          <w:b w:val="0"/>
+          <w:i w:val="0"/>
+        </w:rPr>
+        <w:t>IR sensor published over MQTT (QoS 1) on change, servo latch driven with microsecond pulses (pigpio) and a retained Last-Will status topic; the final prototype syncs a solenoid lock, door state and camera photos with a web dashboard through Firestore.</w:t>
       </w:r>
     </w:p>
     <w:p>
@@ -545,21 +679,7 @@
           <w:b w:val="0"/>
           <w:i w:val="0"/>
         </w:rPr>
-        <w:t>Built a two-channel signal chain: MAX11666 12-bit ADC → order-12 and order-14 FIR filters in C → MCP4822 12-bit DAC, with ADC and DAC sharing one SPI bus.</w:t>
-      </w:r>
-    </w:p>
-    <w:p>
-      <w:pPr>
-        <w:pStyle w:val="ListBullet"/>
-        <w:spacing w:before="0" w:after="20" w:line="240" w:lineRule="auto"/>
-        <w:ind w:left="288" w:hanging="202"/>
-      </w:pPr>
-      <w:r>
-        <w:rPr>
-          <w:b w:val="0"/>
-          <w:i w:val="0"/>
-        </w:rPr>
-        <w:t>Wrote a UART command parser and FSM to switch filter, input and DAC routing at runtime without reflashing.</w:t>
+        <w:t>Two-channel chain: MAX11666 12-bit ADC → order-12/14 FIR filters in C → MCP4822 12-bit DAC on one shared SPI bus, with a UART command parser and FSM to switch filter, input and routing at runtime.</w:t>
       </w:r>
     </w:p>
     <w:p>
@@ -574,7 +694,7 @@
           <w:b/>
           <w:i w:val="0"/>
         </w:rPr>
-        <w:t>Custom Course PCBs</w:t>
+        <w:t>VOLLEY-PONG — Two-Player Game on an FPGA (DE2-115)</w:t>
       </w:r>
       <w:r>
         <w:rPr>
@@ -582,7 +702,7 @@
           <w:i w:val="0"/>
           <w:color w:val="444E5A"/>
         </w:rPr>
-        <w:t xml:space="preserve">  |  Altium Designer</w:t>
+        <w:t xml:space="preserve">  |  VHDL, team of 2</w:t>
       </w:r>
       <w:r>
         <w:rPr>
@@ -591,7 +711,7 @@
           <w:color w:val="444E5A"/>
         </w:rPr>
         <w:tab/>
-        <w:t>2026</w:t>
+        <w:t>2024</w:t>
       </w:r>
     </w:p>
     <w:p>
@@ -605,7 +725,7 @@
           <w:b w:val="0"/>
           <w:i w:val="0"/>
         </w:rPr>
-        <w:t>Designed custom PCBs for hands-on work in Processor-Based Systems Design, from schematic capture to layout.</w:t>
+        <w:t>800×600 VGA sync generator verified in ModelSim, fixed-point ball physics with gravity and collisions, boost meter and scoring in pure VHDL; joystick inputs through LM393 comparators.</w:t>
       </w:r>
     </w:p>
     <w:p>
@@ -620,7 +740,7 @@
           <w:b/>
           <w:i w:val="0"/>
         </w:rPr>
-        <w:t>PROTEO — Raspberry Pi IoT Node</w:t>
+        <w:t>CORRELACIUM-LEVIOSA — Gesture Recognition by Correlation</w:t>
       </w:r>
       <w:r>
         <w:rPr>
@@ -628,7 +748,7 @@
           <w:i w:val="0"/>
           <w:color w:val="444E5A"/>
         </w:rPr>
-        <w:t xml:space="preserve">  |  Python, MQTT, Raspberry Pi</w:t>
+        <w:t xml:space="preserve">  |  MicroPython, I²C, team of 2</w:t>
       </w:r>
       <w:r>
         <w:rPr>
@@ -637,7 +757,7 @@
           <w:color w:val="444E5A"/>
         </w:rPr>
         <w:tab/>
-        <w:t>2025</w:t>
+        <w:t>2024</w:t>
       </w:r>
     </w:p>
     <w:p>
@@ -651,7 +771,7 @@
           <w:b w:val="0"/>
           <w:i w:val="0"/>
         </w:rPr>
-        <w:t>Python service on a Raspberry Pi: publishes an IR sensor over MQTT (QoS 1) and drives a servo from MQTT commands with microsecond pulse widths (pigpio); retained Last-Will topic flags the node offline to the web dashboard.</w:t>
+        <w:t>ADXL345 sampled at 100 Hz into 100-sample windows; four spell gestures matched by correlation against recorded templates with per-class thresholds; result on an SSD1306 OLED.</w:t>
       </w:r>
     </w:p>
     <w:p>
@@ -697,7 +817,7 @@
           <w:b w:val="0"/>
           <w:i w:val="0"/>
         </w:rPr>
-        <w:t>Controlled DC-motor direction and speed through an L298N H-bridge with PWM, a center dead zone and a minimum duty cycle that overcomes static friction; streamed telemetry over serial.</w:t>
+        <w:t>Direction and speed from one potentiometer via an L298N H-bridge (PWM), with a dead zone and a friction-aware minimum duty.</w:t>
       </w:r>
     </w:p>
     <w:p>
@@ -743,66 +863,7 @@
           <w:b w:val="0"/>
           <w:i w:val="0"/>
         </w:rPr>
-        <w:t>Drove two MAX7219 8×8 LED matrices and a 20×4 I²C LCD; read two-player buttons; sequenced audio with an FSM.</w:t>
-      </w:r>
-    </w:p>
-    <w:p>
-      <w:pPr>
-        <w:spacing w:before="120" w:after="40" w:line="240" w:lineRule="auto"/>
-        <w:pBdr>
-          <w:bottom w:val="single" w:sz="6" w:space="1" w:color="0E5A70"/>
-        </w:pBdr>
-      </w:pPr>
-      <w:r>
-        <w:rPr>
-          <w:b/>
-          <w:i w:val="0"/>
-          <w:color w:val="0E5A70"/>
-          <w:sz w:val="21"/>
-        </w:rPr>
-        <w:t>SELECTED SOFTWARE PROJECTS</w:t>
-      </w:r>
-    </w:p>
-    <w:p>
-      <w:pPr>
-        <w:pStyle w:val="ListBullet"/>
-        <w:spacing w:before="0" w:after="20" w:line="240" w:lineRule="auto"/>
-        <w:ind w:left="288" w:hanging="202"/>
-      </w:pPr>
-      <w:r>
-        <w:rPr>
-          <w:b/>
-          <w:i w:val="0"/>
-        </w:rPr>
-        <w:t>Voltio (2026) —</w:t>
-      </w:r>
-      <w:r>
-        <w:rPr>
-          <w:b w:val="0"/>
-          <w:i w:val="0"/>
-        </w:rPr>
-        <w:t xml:space="preserve"> PWA for shared EV charging in a residential complex (pilot: 3 towers, 96 apartments): kWh billing from meter photos, bookings and per-tower consumption reports. JavaScript, Firebase.</w:t>
-      </w:r>
-    </w:p>
-    <w:p>
-      <w:pPr>
-        <w:pStyle w:val="ListBullet"/>
-        <w:spacing w:before="0" w:after="20" w:line="240" w:lineRule="auto"/>
-        <w:ind w:left="288" w:hanging="202"/>
-      </w:pPr>
-      <w:r>
-        <w:rPr>
-          <w:b/>
-          <w:i w:val="0"/>
-        </w:rPr>
-        <w:t>Video_DJ (2026) —</w:t>
-      </w:r>
-      <w:r>
-        <w:rPr>
-          <w:b w:val="0"/>
-          <w:i w:val="0"/>
-        </w:rPr>
-        <w:t xml:space="preserve"> In-progress browser loop station driven by camera-based hand and body tracking, planned in an 11-document engineering spec with a latency analysis. TypeScript.</w:t>
+        <w:t>Two MAX7219 8×8 LED matrices and a 20×4 I²C LCD, two-player buttons and an FSM-sequenced tune.</w:t>
       </w:r>
     </w:p>
     <w:p>
@@ -857,7 +918,7 @@
     </w:p>
     <w:sectPr>
       <w:pgSz w:w="12240" w:h="15840"/>
-      <w:pgMar w:top="720" w:right="864" w:bottom="648" w:left="864" w:header="720" w:footer="720" w:gutter="0"/>
+      <w:pgMar w:top="605" w:right="864" w:bottom="547" w:left="864" w:header="720" w:footer="720" w:gutter="0"/>
       <w:cols w:space="720"/>
       <w:docGrid w:linePitch="360"/>
     </w:sectPr>
@@ -1231,7 +1292,7 @@
     <w:rPr>
       <w:rFonts w:ascii="Calibri" w:hAnsi="Calibri" w:eastAsia="Calibri"/>
       <w:color w:val="111822"/>
-      <w:sz w:val="20"/>
+      <w:sz w:val="19"/>
     </w:rPr>
   </w:style>
   <w:style w:type="paragraph" w:styleId="Header">
@@ -1764,7 +1825,7 @@
     </w:pPr>
     <w:rPr>
       <w:rFonts w:ascii="Calibri" w:hAnsi="Calibri"/>
-      <w:sz w:val="20"/>
+      <w:sz w:val="19"/>
     </w:rPr>
   </w:style>
   <w:style w:type="paragraph" w:styleId="ListBullet2">

</xml_diff>